<commit_message>
updated pfp and resume
</commit_message>
<xml_diff>
--- a/public/resume.docx
+++ b/public/resume.docx
@@ -50,10 +50,10 @@
                 <wp:positionV relativeFrom="paragraph">
                   <wp:posOffset>-330199</wp:posOffset>
                 </wp:positionV>
-                <wp:extent cx="7781925" cy="10067925"/>
+                <wp:extent cx="7791450" cy="10077450"/>
                 <wp:effectExtent b="0" l="0" r="0" t="0"/>
                 <wp:wrapNone/>
-                <wp:docPr id="1465326553" name=""/>
+                <wp:docPr id="1465326555" name=""/>
                 <a:graphic>
                   <a:graphicData uri="http://schemas.microsoft.com/office/word/2010/wordprocessingShape">
                     <wps:wsp>
@@ -69,7 +69,7 @@
                         </a:prstGeom>
                         <a:solidFill>
                           <a:srgbClr val="E0D9EC">
-                            <a:alpha val="12941"/>
+                            <a:alpha val="12549"/>
                           </a:srgbClr>
                         </a:solidFill>
                         <a:ln>
@@ -107,10 +107,10 @@
                 <wp:positionV relativeFrom="paragraph">
                   <wp:posOffset>-330199</wp:posOffset>
                 </wp:positionV>
-                <wp:extent cx="7781925" cy="10067925"/>
+                <wp:extent cx="7791450" cy="10077450"/>
                 <wp:effectExtent b="0" l="0" r="0" t="0"/>
                 <wp:wrapNone/>
-                <wp:docPr id="1465326553" name="image2.png"/>
+                <wp:docPr id="1465326555" name="image2.png"/>
                 <a:graphic>
                   <a:graphicData uri="http://schemas.openxmlformats.org/drawingml/2006/picture">
                     <pic:pic>
@@ -128,7 +128,7 @@
                       <pic:spPr>
                         <a:xfrm>
                           <a:off x="0" y="0"/>
-                          <a:ext cx="7781925" cy="10067925"/>
+                          <a:ext cx="7791450" cy="10077450"/>
                         </a:xfrm>
                         <a:prstGeom prst="rect"/>
                         <a:ln/>
@@ -184,17 +184,13 @@
           <w:p>
             <w:pPr>
               <w:pStyle w:val="Title"/>
-              <w:rPr>
-                <w:rFonts w:ascii="Posterama" w:cs="Posterama" w:eastAsia="Posterama" w:hAnsi="Posterama"/>
-                <w:sz w:val="96"/>
-                <w:szCs w:val="96"/>
-              </w:rPr>
+              <w:rPr/>
             </w:pPr>
             <w:r>
               <w:rPr>
                 <w:rFonts w:ascii="Montserrat" w:cs="Montserrat" w:eastAsia="Montserrat" w:hAnsi="Montserrat"/>
-                <w:sz w:val="96"/>
-                <w:szCs w:val="96"/>
+                <w:sz w:val="90"/>
+                <w:szCs w:val="90"/>
                 <w:rtl w:val="0"/>
               </w:rPr>
               <w:t xml:space="preserve">Johan Söderlund</w:t>
@@ -207,45 +203,6 @@
                 <w:rtl w:val="0"/>
               </w:rPr>
               <w:t xml:space="preserve"> </w:t>
-            </w:r>
-            <w:r>
-              <w:rPr>
-                <w:rFonts w:ascii="Posterama" w:cs="Posterama" w:eastAsia="Posterama" w:hAnsi="Posterama"/>
-                <w:sz w:val="96"/>
-                <w:szCs w:val="96"/>
-              </w:rPr>
-              <w:drawing>
-                <wp:inline distB="0" distT="0" distL="0" distR="0">
-                  <wp:extent cx="729956" cy="723900"/>
-                  <wp:effectExtent b="0" l="0" r="0" t="0"/>
-                  <wp:docPr descr="Stars with solid fill" id="1465326554" name="image1.png"/>
-                  <a:graphic>
-                    <a:graphicData uri="http://schemas.openxmlformats.org/drawingml/2006/picture">
-                      <pic:pic>
-                        <pic:nvPicPr>
-                          <pic:cNvPr descr="Stars with solid fill" id="0" name="image1.png"/>
-                          <pic:cNvPicPr preferRelativeResize="0"/>
-                        </pic:nvPicPr>
-                        <pic:blipFill>
-                          <a:blip r:embed="rId8"/>
-                          <a:srcRect b="0" l="0" r="0" t="0"/>
-                          <a:stretch>
-                            <a:fillRect/>
-                          </a:stretch>
-                        </pic:blipFill>
-                        <pic:spPr>
-                          <a:xfrm>
-                            <a:off x="0" y="0"/>
-                            <a:ext cx="729956" cy="723900"/>
-                          </a:xfrm>
-                          <a:prstGeom prst="rect"/>
-                          <a:ln/>
-                        </pic:spPr>
-                      </pic:pic>
-                    </a:graphicData>
-                  </a:graphic>
-                </wp:inline>
-              </w:drawing>
             </w:r>
             <w:r>
               <w:rPr>
@@ -310,20 +267,82 @@
               <w:tabs>
                 <w:tab w:val="left" w:leader="none" w:pos="720"/>
                 <w:tab w:val="left" w:leader="none" w:pos="1199"/>
+                <w:tab w:val="left" w:leader="none" w:pos="720"/>
+                <w:tab w:val="left" w:leader="none" w:pos="1199"/>
               </w:tabs>
+              <w:rPr>
+                <w:rFonts w:ascii="Montserrat" w:cs="Montserrat" w:eastAsia="Montserrat" w:hAnsi="Montserrat"/>
+              </w:rPr>
+            </w:pPr>
+            <w:bookmarkStart w:colFirst="0" w:colLast="0" w:name="_heading=h.88vug0ix8clp" w:id="0"/>
+            <w:bookmarkEnd w:id="0"/>
+            <w:r>
               <w:rPr>
                 <w:rFonts w:ascii="Montserrat" w:cs="Montserrat" w:eastAsia="Montserrat" w:hAnsi="Montserrat"/>
                 <w:sz w:val="28"/>
                 <w:szCs w:val="28"/>
               </w:rPr>
-            </w:pPr>
-            <w:bookmarkStart w:colFirst="0" w:colLast="0" w:name="_heading=h.zgimo34hk68b" w:id="0"/>
-            <w:bookmarkEnd w:id="0"/>
-            <w:r>
+              <w:drawing>
+                <wp:inline distB="114300" distT="114300" distL="114300" distR="114300">
+                  <wp:extent cx="1671638" cy="1861824"/>
+                  <wp:effectExtent b="0" l="0" r="0" t="0"/>
+                  <wp:docPr id="1465326556" name="image1.jpg"/>
+                  <a:graphic>
+                    <a:graphicData uri="http://schemas.openxmlformats.org/drawingml/2006/picture">
+                      <pic:pic>
+                        <pic:nvPicPr>
+                          <pic:cNvPr id="0" name="image1.jpg"/>
+                          <pic:cNvPicPr preferRelativeResize="0"/>
+                        </pic:nvPicPr>
+                        <pic:blipFill>
+                          <a:blip r:embed="rId8"/>
+                          <a:srcRect b="0" l="0" r="0" t="0"/>
+                          <a:stretch>
+                            <a:fillRect/>
+                          </a:stretch>
+                        </pic:blipFill>
+                        <pic:spPr>
+                          <a:xfrm>
+                            <a:off x="0" y="0"/>
+                            <a:ext cx="1671638" cy="1861824"/>
+                          </a:xfrm>
+                          <a:prstGeom prst="rect"/>
+                          <a:ln/>
+                        </pic:spPr>
+                      </pic:pic>
+                    </a:graphicData>
+                  </a:graphic>
+                </wp:inline>
+              </w:drawing>
+            </w:r>
+            <w:r>
+              <w:rPr>
+                <w:rtl w:val="0"/>
+              </w:rPr>
+            </w:r>
+          </w:p>
+          <w:p>
+            <w:pPr>
+              <w:pStyle w:val="Heading2"/>
+              <w:tabs>
+                <w:tab w:val="left" w:leader="none" w:pos="720"/>
+                <w:tab w:val="left" w:leader="none" w:pos="1199"/>
+                <w:tab w:val="left" w:leader="none" w:pos="720"/>
+                <w:tab w:val="left" w:leader="none" w:pos="1199"/>
+              </w:tabs>
               <w:rPr>
                 <w:rFonts w:ascii="Montserrat" w:cs="Montserrat" w:eastAsia="Montserrat" w:hAnsi="Montserrat"/>
-                <w:sz w:val="28"/>
-                <w:szCs w:val="28"/>
+                <w:sz w:val="26"/>
+                <w:szCs w:val="26"/>
+              </w:rPr>
+            </w:pPr>
+            <w:bookmarkStart w:colFirst="0" w:colLast="0" w:name="_heading=h.70rwmagro5sn" w:id="1"/>
+            <w:bookmarkEnd w:id="1"/>
+            <w:r>
+              <w:rPr>
+                <w:rFonts w:ascii="Montserrat" w:cs="Montserrat" w:eastAsia="Montserrat" w:hAnsi="Montserrat"/>
+                <w:sz w:val="26"/>
+                <w:szCs w:val="26"/>
                 <w:rtl w:val="0"/>
               </w:rPr>
               <w:t xml:space="preserve">PORTFOLIO</w:t>
@@ -331,15 +350,17 @@
           </w:p>
           <w:p>
             <w:pPr>
-              <w:pStyle w:val="Heading3"/>
               <w:tabs>
-                <w:tab w:val="left" w:leader="none" w:pos="900"/>
-                <w:tab w:val="left" w:leader="none" w:pos="1560"/>
+                <w:tab w:val="left" w:leader="none" w:pos="720"/>
+                <w:tab w:val="left" w:leader="none" w:pos="1199"/>
+                <w:tab w:val="left" w:leader="none" w:pos="720"/>
+                <w:tab w:val="left" w:leader="none" w:pos="1199"/>
               </w:tabs>
-              <w:rPr/>
-            </w:pPr>
-            <w:bookmarkStart w:colFirst="0" w:colLast="0" w:name="_heading=h.ekjma87ukgb0" w:id="1"/>
-            <w:bookmarkEnd w:id="1"/>
+              <w:spacing w:line="240" w:lineRule="auto"/>
+              <w:rPr>
+                <w:rFonts w:ascii="Montserrat" w:cs="Montserrat" w:eastAsia="Montserrat" w:hAnsi="Montserrat"/>
+              </w:rPr>
+            </w:pPr>
             <w:hyperlink r:id="rId9">
               <w:r>
                 <w:rPr>
@@ -362,21 +383,6 @@
               <w:tabs>
                 <w:tab w:val="left" w:leader="none" w:pos="720"/>
                 <w:tab w:val="left" w:leader="none" w:pos="1199"/>
-              </w:tabs>
-              <w:rPr>
-                <w:rFonts w:ascii="Montserrat" w:cs="Montserrat" w:eastAsia="Montserrat" w:hAnsi="Montserrat"/>
-              </w:rPr>
-            </w:pPr>
-            <w:r>
-              <w:rPr>
-                <w:rtl w:val="0"/>
-              </w:rPr>
-            </w:r>
-          </w:p>
-          <w:p>
-            <w:pPr>
-              <w:pStyle w:val="Heading2"/>
-              <w:tabs>
                 <w:tab w:val="left" w:leader="none" w:pos="720"/>
                 <w:tab w:val="left" w:leader="none" w:pos="1199"/>
               </w:tabs>
@@ -396,6 +402,8 @@
             <w:pPr>
               <w:pStyle w:val="Heading3"/>
               <w:tabs>
+                <w:tab w:val="left" w:leader="none" w:pos="900"/>
+                <w:tab w:val="left" w:leader="none" w:pos="1560"/>
                 <w:tab w:val="left" w:leader="none" w:pos="900"/>
                 <w:tab w:val="left" w:leader="none" w:pos="1560"/>
               </w:tabs>
@@ -418,6 +426,8 @@
               <w:tabs>
                 <w:tab w:val="left" w:leader="none" w:pos="720"/>
                 <w:tab w:val="left" w:leader="none" w:pos="1199"/>
+                <w:tab w:val="left" w:leader="none" w:pos="720"/>
+                <w:tab w:val="left" w:leader="none" w:pos="1199"/>
               </w:tabs>
               <w:rPr>
                 <w:rFonts w:ascii="Montserrat" w:cs="Montserrat" w:eastAsia="Montserrat" w:hAnsi="Montserrat"/>
@@ -429,7 +439,7 @@
                 <w:rFonts w:ascii="Montserrat" w:cs="Montserrat" w:eastAsia="Montserrat" w:hAnsi="Montserrat"/>
                 <w:rtl w:val="0"/>
               </w:rPr>
-              <w:t xml:space="preserve">TELEFON</w:t>
+              <w:t xml:space="preserve">PHONE</w:t>
             </w:r>
             <w:r>
               <w:rPr>
@@ -443,6 +453,8 @@
               <w:tabs>
                 <w:tab w:val="left" w:leader="none" w:pos="900"/>
                 <w:tab w:val="left" w:leader="none" w:pos="1560"/>
+                <w:tab w:val="left" w:leader="none" w:pos="900"/>
+                <w:tab w:val="left" w:leader="none" w:pos="1560"/>
               </w:tabs>
               <w:rPr/>
             </w:pPr>
@@ -459,6 +471,8 @@
               <w:tabs>
                 <w:tab w:val="left" w:leader="none" w:pos="720"/>
                 <w:tab w:val="left" w:leader="none" w:pos="1199"/>
+                <w:tab w:val="left" w:leader="none" w:pos="720"/>
+                <w:tab w:val="left" w:leader="none" w:pos="1199"/>
               </w:tabs>
               <w:rPr>
                 <w:rFonts w:ascii="Montserrat" w:cs="Montserrat" w:eastAsia="Montserrat" w:hAnsi="Montserrat"/>
@@ -484,10 +498,12 @@
               <w:tabs>
                 <w:tab w:val="left" w:leader="none" w:pos="900"/>
                 <w:tab w:val="left" w:leader="none" w:pos="1560"/>
+                <w:tab w:val="left" w:leader="none" w:pos="900"/>
+                <w:tab w:val="left" w:leader="none" w:pos="1560"/>
               </w:tabs>
               <w:rPr/>
             </w:pPr>
-            <w:bookmarkStart w:colFirst="0" w:colLast="0" w:name="_heading=h.fcs5ua5c2x5e" w:id="2"/>
+            <w:bookmarkStart w:colFirst="0" w:colLast="0" w:name="_heading=h.1hic88lb69v9" w:id="2"/>
             <w:bookmarkEnd w:id="2"/>
             <w:hyperlink r:id="rId10">
               <w:r>
@@ -514,19 +530,16 @@
                 <w:tab w:val="left" w:leader="none" w:pos="720"/>
                 <w:tab w:val="left" w:leader="none" w:pos="1199"/>
               </w:tabs>
+              <w:rPr/>
+            </w:pPr>
+            <w:bookmarkStart w:colFirst="0" w:colLast="0" w:name="_heading=h.63bjymbazh0w" w:id="3"/>
+            <w:bookmarkEnd w:id="3"/>
+            <w:r>
               <w:rPr>
                 <w:rFonts w:ascii="Montserrat" w:cs="Montserrat" w:eastAsia="Montserrat" w:hAnsi="Montserrat"/>
-                <w:color w:val="000000"/>
-              </w:rPr>
-            </w:pPr>
-            <w:bookmarkStart w:colFirst="0" w:colLast="0" w:name="_heading=h.70rwmagro5sn" w:id="3"/>
-            <w:bookmarkEnd w:id="3"/>
-            <w:r>
-              <w:rPr>
-                <w:rFonts w:ascii="Montserrat" w:cs="Montserrat" w:eastAsia="Montserrat" w:hAnsi="Montserrat"/>
-                <w:rtl w:val="0"/>
-              </w:rPr>
-              <w:t xml:space="preserve">LINKEDIN</w:t>
+                <w:rtl w:val="0"/>
+              </w:rPr>
+              <w:t xml:space="preserve">Links</w:t>
             </w:r>
             <w:r>
               <w:rPr>
@@ -537,6 +550,8 @@
           <w:p>
             <w:pPr>
               <w:tabs>
+                <w:tab w:val="left" w:leader="none" w:pos="720"/>
+                <w:tab w:val="left" w:leader="none" w:pos="1199"/>
                 <w:tab w:val="left" w:leader="none" w:pos="720"/>
                 <w:tab w:val="left" w:leader="none" w:pos="1199"/>
               </w:tabs>
@@ -550,47 +565,21 @@
                   <w:u w:val="single"/>
                   <w:rtl w:val="0"/>
                 </w:rPr>
-                <w:t xml:space="preserve">Johan Söderlund</w:t>
+                <w:t xml:space="preserve">Github</w:t>
               </w:r>
             </w:hyperlink>
             <w:r>
               <w:rPr>
                 <w:rtl w:val="0"/>
               </w:rPr>
-            </w:r>
-          </w:p>
-          <w:p>
-            <w:pPr>
-              <w:pStyle w:val="Heading2"/>
+              <w:t xml:space="preserve"> </w:t>
+            </w:r>
+          </w:p>
+          <w:p>
+            <w:pPr>
               <w:tabs>
                 <w:tab w:val="left" w:leader="none" w:pos="720"/>
                 <w:tab w:val="left" w:leader="none" w:pos="1199"/>
-                <w:tab w:val="left" w:leader="none" w:pos="720"/>
-                <w:tab w:val="left" w:leader="none" w:pos="1199"/>
-              </w:tabs>
-              <w:rPr>
-                <w:rFonts w:ascii="Montserrat" w:cs="Montserrat" w:eastAsia="Montserrat" w:hAnsi="Montserrat"/>
-                <w:color w:val="000000"/>
-              </w:rPr>
-            </w:pPr>
-            <w:bookmarkStart w:colFirst="0" w:colLast="0" w:name="_heading=h.bnwzbz10wrm5" w:id="4"/>
-            <w:bookmarkEnd w:id="4"/>
-            <w:r>
-              <w:rPr>
-                <w:rFonts w:ascii="Montserrat" w:cs="Montserrat" w:eastAsia="Montserrat" w:hAnsi="Montserrat"/>
-                <w:rtl w:val="0"/>
-              </w:rPr>
-              <w:t xml:space="preserve">GITHUB</w:t>
-            </w:r>
-            <w:r>
-              <w:rPr>
-                <w:rtl w:val="0"/>
-              </w:rPr>
-            </w:r>
-          </w:p>
-          <w:p>
-            <w:pPr>
-              <w:tabs>
                 <w:tab w:val="left" w:leader="none" w:pos="720"/>
                 <w:tab w:val="left" w:leader="none" w:pos="1199"/>
               </w:tabs>
@@ -604,24 +593,9 @@
                   <w:u w:val="single"/>
                   <w:rtl w:val="0"/>
                 </w:rPr>
-                <w:t xml:space="preserve">jhn322</w:t>
+                <w:t xml:space="preserve">Linkedin</w:t>
               </w:r>
             </w:hyperlink>
-            <w:r>
-              <w:rPr>
-                <w:rtl w:val="0"/>
-              </w:rPr>
-            </w:r>
-          </w:p>
-          <w:p>
-            <w:pPr>
-              <w:tabs>
-                <w:tab w:val="left" w:leader="none" w:pos="720"/>
-                <w:tab w:val="left" w:leader="none" w:pos="1199"/>
-              </w:tabs>
-              <w:spacing w:line="240" w:lineRule="auto"/>
-              <w:rPr/>
-            </w:pPr>
             <w:r>
               <w:rPr>
                 <w:rtl w:val="0"/>
@@ -634,6 +608,8 @@
               <w:tabs>
                 <w:tab w:val="left" w:leader="none" w:pos="2520"/>
                 <w:tab w:val="left" w:leader="none" w:pos="3360"/>
+                <w:tab w:val="left" w:leader="none" w:pos="2520"/>
+                <w:tab w:val="left" w:leader="none" w:pos="3360"/>
               </w:tabs>
               <w:rPr>
                 <w:rFonts w:ascii="Montserrat" w:cs="Montserrat" w:eastAsia="Montserrat" w:hAnsi="Montserrat"/>
@@ -644,38 +620,18 @@
                 <w:rFonts w:ascii="Montserrat" w:cs="Montserrat" w:eastAsia="Montserrat" w:hAnsi="Montserrat"/>
                 <w:rtl w:val="0"/>
               </w:rPr>
-              <w:t xml:space="preserve">MÅLSÄTTNING</w:t>
-            </w:r>
-            <w:r>
-              <w:rPr>
-                <w:rtl w:val="0"/>
-              </w:rPr>
-            </w:r>
-          </w:p>
-          <w:p>
-            <w:pPr>
-              <w:rPr/>
-            </w:pPr>
-            <w:r>
-              <w:rPr>
-                <w:rtl w:val="0"/>
-              </w:rPr>
-              <w:t xml:space="preserve">Dedikerad fullstackutvecklare med fokus på moderna webbramverk och robusta backend lösningar. Jag strävar efter att bidra med lösningar som både är skalbara och användarvänliga. Söker en givande utvecklingsmiljö där jag kan växa och leverera genom smart kod och bra samarbete.</w:t>
-            </w:r>
-            <w:r>
-              <w:rPr>
-                <w:rtl w:val="0"/>
-              </w:rPr>
-            </w:r>
-          </w:p>
-          <w:p>
-            <w:pPr>
-              <w:rPr/>
-            </w:pPr>
-            <w:r>
-              <w:rPr>
-                <w:rtl w:val="0"/>
-              </w:rPr>
+              <w:t xml:space="preserve">OBJECTIVE</w:t>
+            </w:r>
+          </w:p>
+          <w:p>
+            <w:pPr>
+              <w:rPr/>
+            </w:pPr>
+            <w:r>
+              <w:rPr>
+                <w:rtl w:val="0"/>
+              </w:rPr>
+              <w:t xml:space="preserve">Dedicated full stack developer with a focus on modern web frameworks and robust backend solutions. I strive to contribute with solutions that are both scalable and user-friendly. Looking for a rewarding development environment where I can grow and deliver through smart code and strong collaboration.</w:t>
             </w:r>
           </w:p>
           <w:p>
@@ -684,6 +640,8 @@
               <w:tabs>
                 <w:tab w:val="left" w:leader="none" w:pos="2520"/>
                 <w:tab w:val="left" w:leader="none" w:pos="3360"/>
+                <w:tab w:val="left" w:leader="none" w:pos="2520"/>
+                <w:tab w:val="left" w:leader="none" w:pos="3360"/>
               </w:tabs>
               <w:rPr>
                 <w:rFonts w:ascii="Montserrat" w:cs="Montserrat" w:eastAsia="Montserrat" w:hAnsi="Montserrat"/>
@@ -694,14 +652,13 @@
                 <w:rFonts w:ascii="Montserrat" w:cs="Montserrat" w:eastAsia="Montserrat" w:hAnsi="Montserrat"/>
                 <w:rtl w:val="0"/>
               </w:rPr>
-              <w:t xml:space="preserve">KUNSKAPER</w:t>
+              <w:t xml:space="preserve">SKILLS</w:t>
             </w:r>
           </w:p>
           <w:p>
             <w:pPr>
               <w:keepNext w:val="0"/>
               <w:keepLines w:val="0"/>
-              <w:pageBreakBefore w:val="0"/>
               <w:widowControl w:val="1"/>
               <w:pBdr>
                 <w:top w:space="0" w:sz="0" w:val="nil"/>
@@ -717,7 +674,6 @@
               <w:rPr>
                 <w:rFonts w:ascii="Arial" w:cs="Arial" w:eastAsia="Arial" w:hAnsi="Arial"/>
                 <w:b w:val="0"/>
-                <w:i w:val="0"/>
                 <w:smallCaps w:val="0"/>
                 <w:strike w:val="0"/>
                 <w:color w:val="000000"/>
@@ -732,7 +688,28 @@
               <w:rPr>
                 <w:rtl w:val="0"/>
               </w:rPr>
-              <w:t xml:space="preserve">TypeScript/JavaScript</w:t>
+              <w:t xml:space="preserve">TypeScript/JavaScript, </w:t>
+            </w:r>
+            <w:r>
+              <w:rPr>
+                <w:rtl w:val="0"/>
+              </w:rPr>
+              <w:t xml:space="preserve">Next.js/React</w:t>
+            </w:r>
+            <w:r>
+              <w:rPr>
+                <w:rtl w:val="0"/>
+              </w:rPr>
+              <w:t xml:space="preserve">, TailwindCSS, Modern UI-libraries, MongoDB, Prisma, Docker, Agile </w:t>
+            </w:r>
+            <w:r>
+              <w:rPr>
+                <w:color w:val="00000a"/>
+                <w:sz w:val="22"/>
+                <w:szCs w:val="22"/>
+                <w:rtl w:val="0"/>
+              </w:rPr>
+              <w:t xml:space="preserve">workflow</w:t>
             </w:r>
             <w:r>
               <w:rPr>
@@ -744,7 +721,6 @@
             <w:pPr>
               <w:keepNext w:val="0"/>
               <w:keepLines w:val="0"/>
-              <w:pageBreakBefore w:val="0"/>
               <w:widowControl w:val="1"/>
               <w:pBdr>
                 <w:top w:space="0" w:sz="0" w:val="nil"/>
@@ -757,273 +733,6 @@
               <w:spacing w:after="0" w:before="0" w:line="360" w:lineRule="auto"/>
               <w:ind w:left="0" w:right="0" w:firstLine="0"/>
               <w:jc w:val="left"/>
-              <w:rPr>
-                <w:rFonts w:ascii="Arial" w:cs="Arial" w:eastAsia="Arial" w:hAnsi="Arial"/>
-                <w:b w:val="0"/>
-                <w:i w:val="0"/>
-                <w:smallCaps w:val="0"/>
-                <w:strike w:val="0"/>
-                <w:color w:val="000000"/>
-                <w:sz w:val="20"/>
-                <w:szCs w:val="20"/>
-                <w:u w:val="none"/>
-                <w:shd w:fill="auto" w:val="clear"/>
-                <w:vertAlign w:val="baseline"/>
-              </w:rPr>
-            </w:pPr>
-            <w:r>
-              <w:rPr>
-                <w:rtl w:val="0"/>
-              </w:rPr>
-              <w:t xml:space="preserve">Next.js/React</w:t>
-            </w:r>
-            <w:r>
-              <w:rPr>
-                <w:rtl w:val="0"/>
-              </w:rPr>
-            </w:r>
-          </w:p>
-          <w:p>
-            <w:pPr>
-              <w:keepNext w:val="0"/>
-              <w:keepLines w:val="0"/>
-              <w:pageBreakBefore w:val="0"/>
-              <w:widowControl w:val="1"/>
-              <w:pBdr>
-                <w:top w:space="0" w:sz="0" w:val="nil"/>
-                <w:left w:space="0" w:sz="0" w:val="nil"/>
-                <w:bottom w:space="0" w:sz="0" w:val="nil"/>
-                <w:right w:space="0" w:sz="0" w:val="nil"/>
-                <w:between w:space="0" w:sz="0" w:val="nil"/>
-              </w:pBdr>
-              <w:shd w:fill="auto" w:val="clear"/>
-              <w:spacing w:after="0" w:before="0" w:line="360" w:lineRule="auto"/>
-              <w:ind w:left="0" w:right="0" w:firstLine="0"/>
-              <w:jc w:val="left"/>
-              <w:rPr>
-                <w:rFonts w:ascii="Arial" w:cs="Arial" w:eastAsia="Arial" w:hAnsi="Arial"/>
-                <w:b w:val="0"/>
-                <w:i w:val="0"/>
-                <w:smallCaps w:val="0"/>
-                <w:strike w:val="0"/>
-                <w:color w:val="000000"/>
-                <w:sz w:val="20"/>
-                <w:szCs w:val="20"/>
-                <w:u w:val="none"/>
-                <w:shd w:fill="auto" w:val="clear"/>
-                <w:vertAlign w:val="baseline"/>
-              </w:rPr>
-            </w:pPr>
-            <w:r>
-              <w:rPr>
-                <w:rtl w:val="0"/>
-              </w:rPr>
-              <w:t xml:space="preserve">TailwindCSS</w:t>
-            </w:r>
-            <w:r>
-              <w:rPr>
-                <w:rtl w:val="0"/>
-              </w:rPr>
-            </w:r>
-          </w:p>
-          <w:p>
-            <w:pPr>
-              <w:keepNext w:val="0"/>
-              <w:keepLines w:val="0"/>
-              <w:pageBreakBefore w:val="0"/>
-              <w:widowControl w:val="1"/>
-              <w:pBdr>
-                <w:top w:space="0" w:sz="0" w:val="nil"/>
-                <w:left w:space="0" w:sz="0" w:val="nil"/>
-                <w:bottom w:space="0" w:sz="0" w:val="nil"/>
-                <w:right w:space="0" w:sz="0" w:val="nil"/>
-                <w:between w:space="0" w:sz="0" w:val="nil"/>
-              </w:pBdr>
-              <w:shd w:fill="auto" w:val="clear"/>
-              <w:spacing w:after="0" w:before="0" w:line="360" w:lineRule="auto"/>
-              <w:ind w:left="0" w:right="0" w:firstLine="0"/>
-              <w:jc w:val="left"/>
-              <w:rPr>
-                <w:rFonts w:ascii="Arial" w:cs="Arial" w:eastAsia="Arial" w:hAnsi="Arial"/>
-                <w:b w:val="0"/>
-                <w:i w:val="0"/>
-                <w:smallCaps w:val="0"/>
-                <w:strike w:val="0"/>
-                <w:color w:val="000000"/>
-                <w:sz w:val="20"/>
-                <w:szCs w:val="20"/>
-                <w:u w:val="none"/>
-                <w:shd w:fill="auto" w:val="clear"/>
-                <w:vertAlign w:val="baseline"/>
-              </w:rPr>
-            </w:pPr>
-            <w:r>
-              <w:rPr>
-                <w:rtl w:val="0"/>
-              </w:rPr>
-              <w:t xml:space="preserve">Moderna UI-bibliotek</w:t>
-            </w:r>
-            <w:r>
-              <w:rPr>
-                <w:rtl w:val="0"/>
-              </w:rPr>
-            </w:r>
-          </w:p>
-          <w:p>
-            <w:pPr>
-              <w:keepNext w:val="0"/>
-              <w:keepLines w:val="0"/>
-              <w:pageBreakBefore w:val="0"/>
-              <w:widowControl w:val="1"/>
-              <w:pBdr>
-                <w:top w:space="0" w:sz="0" w:val="nil"/>
-                <w:left w:space="0" w:sz="0" w:val="nil"/>
-                <w:bottom w:space="0" w:sz="0" w:val="nil"/>
-                <w:right w:space="0" w:sz="0" w:val="nil"/>
-                <w:between w:space="0" w:sz="0" w:val="nil"/>
-              </w:pBdr>
-              <w:shd w:fill="auto" w:val="clear"/>
-              <w:spacing w:after="0" w:before="0" w:line="360" w:lineRule="auto"/>
-              <w:ind w:left="0" w:right="0" w:firstLine="0"/>
-              <w:jc w:val="left"/>
-              <w:rPr/>
-            </w:pPr>
-            <w:r>
-              <w:rPr>
-                <w:rtl w:val="0"/>
-              </w:rPr>
-              <w:t xml:space="preserve">MongoDB &amp; PostgreSQL</w:t>
-            </w:r>
-          </w:p>
-          <w:p>
-            <w:pPr>
-              <w:keepNext w:val="0"/>
-              <w:keepLines w:val="0"/>
-              <w:pageBreakBefore w:val="0"/>
-              <w:widowControl w:val="1"/>
-              <w:pBdr>
-                <w:top w:space="0" w:sz="0" w:val="nil"/>
-                <w:left w:space="0" w:sz="0" w:val="nil"/>
-                <w:bottom w:space="0" w:sz="0" w:val="nil"/>
-                <w:right w:space="0" w:sz="0" w:val="nil"/>
-                <w:between w:space="0" w:sz="0" w:val="nil"/>
-              </w:pBdr>
-              <w:shd w:fill="auto" w:val="clear"/>
-              <w:spacing w:after="0" w:before="0" w:line="360" w:lineRule="auto"/>
-              <w:ind w:left="0" w:right="0" w:firstLine="0"/>
-              <w:jc w:val="left"/>
-              <w:rPr/>
-            </w:pPr>
-            <w:r>
-              <w:rPr>
-                <w:rtl w:val="0"/>
-              </w:rPr>
-              <w:t xml:space="preserve">Prisma</w:t>
-            </w:r>
-          </w:p>
-          <w:p>
-            <w:pPr>
-              <w:keepNext w:val="0"/>
-              <w:keepLines w:val="0"/>
-              <w:pageBreakBefore w:val="0"/>
-              <w:widowControl w:val="1"/>
-              <w:pBdr>
-                <w:top w:space="0" w:sz="0" w:val="nil"/>
-                <w:left w:space="0" w:sz="0" w:val="nil"/>
-                <w:bottom w:space="0" w:sz="0" w:val="nil"/>
-                <w:right w:space="0" w:sz="0" w:val="nil"/>
-                <w:between w:space="0" w:sz="0" w:val="nil"/>
-              </w:pBdr>
-              <w:shd w:fill="auto" w:val="clear"/>
-              <w:spacing w:after="0" w:before="0" w:line="360" w:lineRule="auto"/>
-              <w:ind w:left="0" w:right="0" w:firstLine="0"/>
-              <w:jc w:val="left"/>
-              <w:rPr/>
-            </w:pPr>
-            <w:r>
-              <w:rPr>
-                <w:rtl w:val="0"/>
-              </w:rPr>
-              <w:t xml:space="preserve">Three.js</w:t>
-            </w:r>
-            <w:r>
-              <w:rPr>
-                <w:rtl w:val="0"/>
-              </w:rPr>
-            </w:r>
-          </w:p>
-          <w:p>
-            <w:pPr>
-              <w:spacing w:line="360" w:lineRule="auto"/>
-              <w:rPr/>
-            </w:pPr>
-            <w:r>
-              <w:rPr>
-                <w:rtl w:val="0"/>
-              </w:rPr>
-              <w:t xml:space="preserve">Docker</w:t>
-            </w:r>
-          </w:p>
-          <w:p>
-            <w:pPr>
-              <w:keepNext w:val="0"/>
-              <w:keepLines w:val="0"/>
-              <w:pageBreakBefore w:val="0"/>
-              <w:widowControl w:val="1"/>
-              <w:pBdr>
-                <w:top w:space="0" w:sz="0" w:val="nil"/>
-                <w:left w:space="0" w:sz="0" w:val="nil"/>
-                <w:bottom w:space="0" w:sz="0" w:val="nil"/>
-                <w:right w:space="0" w:sz="0" w:val="nil"/>
-                <w:between w:space="0" w:sz="0" w:val="nil"/>
-              </w:pBdr>
-              <w:shd w:fill="auto" w:val="clear"/>
-              <w:spacing w:after="0" w:before="0" w:line="360" w:lineRule="auto"/>
-              <w:ind w:left="0" w:right="0" w:firstLine="0"/>
-              <w:jc w:val="left"/>
-              <w:rPr>
-                <w:rFonts w:ascii="Arial" w:cs="Arial" w:eastAsia="Arial" w:hAnsi="Arial"/>
-                <w:b w:val="0"/>
-                <w:i w:val="0"/>
-                <w:smallCaps w:val="0"/>
-                <w:strike w:val="0"/>
-                <w:color w:val="000000"/>
-                <w:sz w:val="20"/>
-                <w:szCs w:val="20"/>
-                <w:u w:val="none"/>
-                <w:shd w:fill="auto" w:val="clear"/>
-                <w:vertAlign w:val="baseline"/>
-              </w:rPr>
-            </w:pPr>
-            <w:r>
-              <w:rPr>
-                <w:rtl w:val="0"/>
-              </w:rPr>
-              <w:t xml:space="preserve">Agila Metoder</w:t>
-            </w:r>
-            <w:r>
-              <w:rPr>
-                <w:rtl w:val="0"/>
-              </w:rPr>
-            </w:r>
-          </w:p>
-          <w:p>
-            <w:pPr>
-              <w:keepNext w:val="0"/>
-              <w:keepLines w:val="0"/>
-              <w:pageBreakBefore w:val="0"/>
-              <w:widowControl w:val="1"/>
-              <w:pBdr>
-                <w:top w:space="0" w:sz="0" w:val="nil"/>
-                <w:left w:space="0" w:sz="0" w:val="nil"/>
-                <w:bottom w:space="0" w:sz="0" w:val="nil"/>
-                <w:right w:space="0" w:sz="0" w:val="nil"/>
-                <w:between w:space="0" w:sz="0" w:val="nil"/>
-              </w:pBdr>
-              <w:shd w:fill="auto" w:val="clear"/>
-              <w:spacing w:after="0" w:before="0" w:line="360" w:lineRule="auto"/>
-              <w:ind w:left="0" w:right="0" w:firstLine="0"/>
-              <w:jc w:val="left"/>
               <w:rPr/>
             </w:pPr>
             <w:r>
@@ -1076,6 +785,8 @@
               <w:tabs>
                 <w:tab w:val="left" w:leader="none" w:pos="2520"/>
                 <w:tab w:val="left" w:leader="none" w:pos="3360"/>
+                <w:tab w:val="left" w:leader="none" w:pos="2520"/>
+                <w:tab w:val="left" w:leader="none" w:pos="3360"/>
               </w:tabs>
               <w:rPr>
                 <w:rFonts w:ascii="Montserrat" w:cs="Montserrat" w:eastAsia="Montserrat" w:hAnsi="Montserrat"/>
@@ -1086,7 +797,7 @@
                 <w:rFonts w:ascii="Montserrat" w:cs="Montserrat" w:eastAsia="Montserrat" w:hAnsi="Montserrat"/>
                 <w:rtl w:val="0"/>
               </w:rPr>
-              <w:t xml:space="preserve">ERFARENHETER</w:t>
+              <w:t xml:space="preserve">EXPERIENCE</w:t>
             </w:r>
           </w:p>
         </w:tc>
@@ -1341,7 +1052,7 @@
                 <w:szCs w:val="20"/>
                 <w:rtl w:val="0"/>
               </w:rPr>
-              <w:t xml:space="preserve">Jan 2025 – Maj 2025</w:t>
+              <w:t xml:space="preserve">Jan 2025 – May 2025</w:t>
             </w:r>
             <w:r>
               <w:rPr>
@@ -1360,13 +1071,7 @@
               <w:rPr>
                 <w:rtl w:val="0"/>
               </w:rPr>
-              <w:t xml:space="preserve">Fullstackutvecklare</w:t>
-            </w:r>
-            <w:r>
-              <w:rPr>
-                <w:rtl w:val="0"/>
-              </w:rPr>
-              <w:t xml:space="preserve"> • </w:t>
+              <w:t xml:space="preserve">Full-stack Developer • </w:t>
             </w:r>
             <w:hyperlink r:id="rId13">
               <w:r>
@@ -1382,7 +1087,7 @@
               <w:rPr>
                 <w:rtl w:val="0"/>
               </w:rPr>
-              <w:t xml:space="preserve"> • Distans</w:t>
+              <w:t xml:space="preserve"> • Remote</w:t>
             </w:r>
           </w:p>
           <w:p>
@@ -1405,7 +1110,7 @@
                 <w:szCs w:val="22"/>
                 <w:rtl w:val="0"/>
               </w:rPr>
-              <w:t xml:space="preserve">Frontend- och Backend utveckling i Typescript/Javascript, Nextjs, React, Tailwind, Shadcn/ui, MongoDB, Prisma, Docker m.m. Agila metoder, Scrum, Projekt ledning, DevOps.</w:t>
+              <w:t xml:space="preserve">Frontend- and Backend development in Typescript/Javascript, Nextjs, React, Tailwind, Shadcn/ui, MongoDB, Prisma, Docker and more. Agile methodology, Scrum, Project leading, DevOps.</w:t>
             </w:r>
             <w:r>
               <w:rPr>
@@ -1452,13 +1157,7 @@
               <w:rPr>
                 <w:rtl w:val="0"/>
               </w:rPr>
-              <w:t xml:space="preserve">Mjölkbehandlingsavdelning</w:t>
-            </w:r>
-            <w:r>
-              <w:rPr>
-                <w:rtl w:val="0"/>
-              </w:rPr>
-              <w:t xml:space="preserve"> • </w:t>
+              <w:t xml:space="preserve">Milk Processing Department • </w:t>
             </w:r>
             <w:hyperlink r:id="rId14">
               <w:r>
@@ -1494,7 +1193,7 @@
                 <w:szCs w:val="22"/>
                 <w:rtl w:val="0"/>
               </w:rPr>
-              <w:t xml:space="preserve">Provtagning av fetthalt, protein, laktos, pH, nitrat på mjölk, fil, yoghurt, grädde. Överseende av samtliga lokaler för underhåll, läckage och städning.</w:t>
+              <w:t xml:space="preserve">Sampling of fat content, protein, lactose, pH, and nitrate in milk, yogurt, and cream. Supervision of all facilities for maintenance, leakage, and cleaning.</w:t>
             </w:r>
             <w:r>
               <w:rPr>
@@ -1539,13 +1238,7 @@
               <w:rPr>
                 <w:rtl w:val="0"/>
               </w:rPr>
-              <w:t xml:space="preserve">Lokalvårdare </w:t>
-            </w:r>
-            <w:r>
-              <w:rPr>
-                <w:rtl w:val="0"/>
-              </w:rPr>
-              <w:t xml:space="preserve">• Umeå Städservice • Umeå</w:t>
+              <w:t xml:space="preserve">Cleaner • Umeå Städservice • Umeå</w:t>
             </w:r>
           </w:p>
           <w:p>
@@ -1555,11 +1248,7 @@
                 <w:tab w:val="right" w:leader="none" w:pos="9638"/>
               </w:tabs>
               <w:spacing w:line="240" w:lineRule="auto"/>
-              <w:rPr>
-                <w:color w:val="00000a"/>
-                <w:sz w:val="24"/>
-                <w:szCs w:val="24"/>
-              </w:rPr>
+              <w:rPr/>
             </w:pPr>
             <w:r>
               <w:rPr>
@@ -1569,52 +1258,7 @@
                 <w:szCs w:val="22"/>
                 <w:rtl w:val="0"/>
               </w:rPr>
-              <w:t xml:space="preserve">Golvmoppning, </w:t>
-            </w:r>
-            <w:r>
-              <w:rPr>
-                <w:i w:val="1"/>
-                <w:color w:val="00000a"/>
-                <w:sz w:val="22"/>
-                <w:szCs w:val="22"/>
-                <w:rtl w:val="0"/>
-              </w:rPr>
-              <w:t xml:space="preserve">skurmaskin,</w:t>
-            </w:r>
-            <w:r>
-              <w:rPr>
-                <w:i w:val="1"/>
-                <w:color w:val="00000a"/>
-                <w:sz w:val="22"/>
-                <w:szCs w:val="22"/>
-                <w:rtl w:val="0"/>
-              </w:rPr>
-              <w:t xml:space="preserve"> dammtorkning, städa lokaler.</w:t>
-            </w:r>
-            <w:r>
-              <w:rPr>
-                <w:rtl w:val="0"/>
-              </w:rPr>
-            </w:r>
-          </w:p>
-          <w:p>
-            <w:pPr>
-              <w:widowControl w:val="0"/>
-              <w:tabs>
-                <w:tab w:val="right" w:leader="none" w:pos="9638"/>
-              </w:tabs>
-              <w:spacing w:line="240" w:lineRule="auto"/>
-              <w:rPr/>
-            </w:pPr>
-            <w:r>
-              <w:rPr>
-                <w:i w:val="1"/>
-                <w:color w:val="00000a"/>
-                <w:sz w:val="22"/>
-                <w:szCs w:val="22"/>
-                <w:rtl w:val="0"/>
-              </w:rPr>
-              <w:t xml:space="preserve">Ansvar över dagligt schema och sekretess för kunder &amp; alarmsystem.  </w:t>
+              <w:t xml:space="preserve">Floor mopping, scrubbing machine, cleaning of facilities. Responsible for the daily schedule and confidentiality regarding clients and alarm systems.  </w:t>
             </w:r>
             <w:r>
               <w:rPr>
@@ -1717,6 +1361,8 @@
               <w:tabs>
                 <w:tab w:val="left" w:leader="none" w:pos="2520"/>
                 <w:tab w:val="left" w:leader="none" w:pos="3360"/>
+                <w:tab w:val="left" w:leader="none" w:pos="2520"/>
+                <w:tab w:val="left" w:leader="none" w:pos="3360"/>
               </w:tabs>
               <w:rPr>
                 <w:rFonts w:ascii="Montserrat" w:cs="Montserrat" w:eastAsia="Montserrat" w:hAnsi="Montserrat"/>
@@ -1727,7 +1373,7 @@
                 <w:rFonts w:ascii="Montserrat" w:cs="Montserrat" w:eastAsia="Montserrat" w:hAnsi="Montserrat"/>
                 <w:rtl w:val="0"/>
               </w:rPr>
-              <w:t xml:space="preserve">UTBILDNINGAR</w:t>
+              <w:t xml:space="preserve">EDUCATION</w:t>
             </w:r>
           </w:p>
         </w:tc>
@@ -1993,11 +1639,21 @@
               <w:pStyle w:val="Heading5"/>
               <w:rPr/>
             </w:pPr>
-            <w:r>
-              <w:rPr>
-                <w:rtl w:val="0"/>
-              </w:rPr>
-              <w:t xml:space="preserve">Fullstack JavaScript Extended • Chas Academy • Distans/Umeå</w:t>
+            <w:hyperlink r:id="rId15">
+              <w:r>
+                <w:rPr>
+                  <w:color w:val="1155cc"/>
+                  <w:u w:val="single"/>
+                  <w:rtl w:val="0"/>
+                </w:rPr>
+                <w:t xml:space="preserve">Fullstack JavaScript Extended</w:t>
+              </w:r>
+            </w:hyperlink>
+            <w:r>
+              <w:rPr>
+                <w:rtl w:val="0"/>
+              </w:rPr>
+              <w:t xml:space="preserve"> • Chas Academy • Remote/Umeå</w:t>
             </w:r>
           </w:p>
           <w:p>
@@ -2026,13 +1682,7 @@
               <w:rPr>
                 <w:rtl w:val="0"/>
               </w:rPr>
-              <w:t xml:space="preserve">Dator- och Kommunikationsteknik </w:t>
-            </w:r>
-            <w:r>
-              <w:rPr>
-                <w:rtl w:val="0"/>
-              </w:rPr>
-              <w:t xml:space="preserve">• Vuxenutbildning • Umeå</w:t>
+              <w:t xml:space="preserve">Computer and Communication Technology • Adult Education • Umeå</w:t>
             </w:r>
           </w:p>
           <w:p>
@@ -2043,8 +1693,8 @@
                 <w:szCs w:val="20"/>
               </w:rPr>
             </w:pPr>
-            <w:bookmarkStart w:colFirst="0" w:colLast="0" w:name="_heading=h.j8k923vbqvlf" w:id="5"/>
-            <w:bookmarkEnd w:id="5"/>
+            <w:bookmarkStart w:colFirst="0" w:colLast="0" w:name="_heading=h.j8k923vbqvlf" w:id="4"/>
+            <w:bookmarkEnd w:id="4"/>
             <w:r>
               <w:rPr>
                 <w:sz w:val="20"/>
@@ -2059,24 +1709,13 @@
               <w:pStyle w:val="Heading5"/>
               <w:rPr/>
             </w:pPr>
-            <w:bookmarkStart w:colFirst="0" w:colLast="0" w:name="_heading=h.ka74rgiuruzg" w:id="6"/>
-            <w:bookmarkEnd w:id="6"/>
-            <w:r>
-              <w:rPr>
-                <w:rtl w:val="0"/>
-              </w:rPr>
-              <w:t xml:space="preserve">El- och Energiprogrammet</w:t>
-            </w:r>
-            <w:r>
-              <w:rPr>
-                <w:rtl w:val="0"/>
-              </w:rPr>
-              <w:t xml:space="preserve"> • Dragonskolan • Umeå</w:t>
-            </w:r>
-            <w:r>
-              <w:rPr>
-                <w:rtl w:val="0"/>
-              </w:rPr>
+            <w:bookmarkStart w:colFirst="0" w:colLast="0" w:name="_heading=h.ka74rgiuruzg" w:id="5"/>
+            <w:bookmarkEnd w:id="5"/>
+            <w:r>
+              <w:rPr>
+                <w:rtl w:val="0"/>
+              </w:rPr>
+              <w:t xml:space="preserve">Electrical and Energy Program • Dragonskolan • Umeå</w:t>
             </w:r>
           </w:p>
         </w:tc>
@@ -2175,6 +1814,8 @@
               <w:tabs>
                 <w:tab w:val="left" w:leader="none" w:pos="2520"/>
                 <w:tab w:val="left" w:leader="none" w:pos="3360"/>
+                <w:tab w:val="left" w:leader="none" w:pos="2520"/>
+                <w:tab w:val="left" w:leader="none" w:pos="3360"/>
               </w:tabs>
               <w:rPr>
                 <w:rFonts w:ascii="Montserrat" w:cs="Montserrat" w:eastAsia="Montserrat" w:hAnsi="Montserrat"/>
@@ -2185,7 +1826,7 @@
                 <w:rFonts w:ascii="Montserrat" w:cs="Montserrat" w:eastAsia="Montserrat" w:hAnsi="Montserrat"/>
                 <w:rtl w:val="0"/>
               </w:rPr>
-              <w:t xml:space="preserve">PROJEKT (GITHUB)</w:t>
+              <w:t xml:space="preserve">PROJECTS (GITHUB)</w:t>
             </w:r>
           </w:p>
         </w:tc>
@@ -2433,8 +2074,9 @@
                 <w:numId w:val="1"/>
               </w:numPr>
               <w:ind w:left="720" w:hanging="360"/>
-            </w:pPr>
-            <w:hyperlink r:id="rId15">
+              <w:rPr/>
+            </w:pPr>
+            <w:hyperlink r:id="rId16">
               <w:r>
                 <w:rPr>
                   <w:color w:val="1155cc"/>
@@ -2448,7 +2090,7 @@
               <w:rPr>
                 <w:rtl w:val="0"/>
               </w:rPr>
-              <w:t xml:space="preserve"> - Schack app i Next.js, Shadcn/ui och MongoDB.</w:t>
+              <w:t xml:space="preserve"> - Chess app in Next.js, Shadcn/ui and MongoDB.</w:t>
             </w:r>
           </w:p>
           <w:p>
@@ -2458,8 +2100,9 @@
                 <w:numId w:val="1"/>
               </w:numPr>
               <w:ind w:left="720" w:hanging="360"/>
-            </w:pPr>
-            <w:hyperlink r:id="rId16">
+              <w:rPr/>
+            </w:pPr>
+            <w:hyperlink r:id="rId17">
               <w:r>
                 <w:rPr>
                   <w:color w:val="1155cc"/>
@@ -2473,18 +2116,7 @@
               <w:rPr>
                 <w:rtl w:val="0"/>
               </w:rPr>
-              <w:t xml:space="preserve"> - Företagssida i Next.js, Framer-motion och </w:t>
-            </w:r>
-            <w:r>
-              <w:rPr>
-                <w:rtl w:val="0"/>
-              </w:rPr>
-              <w:t xml:space="preserve">TailwindCSS.</w:t>
-            </w:r>
-            <w:r>
-              <w:rPr>
-                <w:rtl w:val="0"/>
-              </w:rPr>
+              <w:t xml:space="preserve"> - Business page in Next.js, Framer-motion and TailwindCSS.</w:t>
             </w:r>
           </w:p>
           <w:p>
@@ -2494,8 +2126,9 @@
                 <w:numId w:val="1"/>
               </w:numPr>
               <w:ind w:left="720" w:hanging="360"/>
-            </w:pPr>
-            <w:hyperlink r:id="rId17">
+              <w:rPr/>
+            </w:pPr>
+            <w:hyperlink r:id="rId18">
               <w:r>
                 <w:rPr>
                   <w:color w:val="1155cc"/>
@@ -2509,7 +2142,7 @@
               <w:rPr>
                 <w:rtl w:val="0"/>
               </w:rPr>
-              <w:t xml:space="preserve">- Config-filer till Python script, YAML, Docker och Photshop.  </w:t>
+              <w:t xml:space="preserve">- Config-files for Python script, YAML, Docker and Photoshop.  </w:t>
             </w:r>
           </w:p>
           <w:p>
@@ -2523,7 +2156,7 @@
                 <w:u w:val="none"/>
               </w:rPr>
             </w:pPr>
-            <w:hyperlink r:id="rId18">
+            <w:hyperlink r:id="rId19">
               <w:r>
                 <w:rPr>
                   <w:color w:val="1155cc"/>
@@ -2537,7 +2170,12 @@
               <w:rPr>
                 <w:rtl w:val="0"/>
               </w:rPr>
-              <w:t xml:space="preserve"> - Informationssida i JavaScript, React och Analytics.</w:t>
+              <w:t xml:space="preserve"> - Information site in JavaScript, React and Analytics.</w:t>
+            </w:r>
+            <w:r>
+              <w:rPr>
+                <w:rtl w:val="0"/>
+              </w:rPr>
             </w:r>
           </w:p>
         </w:tc>
@@ -2582,7 +2220,9 @@
               <w:spacing w:after="0" w:before="0" w:line="276" w:lineRule="auto"/>
               <w:ind w:left="0" w:right="0" w:firstLine="0"/>
               <w:jc w:val="left"/>
-              <w:rPr/>
+              <w:rPr>
+                <w:u w:val="none"/>
+              </w:rPr>
             </w:pPr>
             <w:r>
               <w:rPr>
@@ -2615,7 +2255,9 @@
               <w:spacing w:after="0" w:before="0" w:line="276" w:lineRule="auto"/>
               <w:ind w:left="0" w:right="0" w:firstLine="0"/>
               <w:jc w:val="left"/>
-              <w:rPr/>
+              <w:rPr>
+                <w:u w:val="none"/>
+              </w:rPr>
             </w:pPr>
             <w:r>
               <w:rPr>
@@ -2635,6 +2277,8 @@
               <w:tabs>
                 <w:tab w:val="left" w:leader="none" w:pos="2520"/>
                 <w:tab w:val="left" w:leader="none" w:pos="3360"/>
+                <w:tab w:val="left" w:leader="none" w:pos="2520"/>
+                <w:tab w:val="left" w:leader="none" w:pos="3360"/>
               </w:tabs>
               <w:rPr>
                 <w:rFonts w:ascii="Montserrat" w:cs="Montserrat" w:eastAsia="Montserrat" w:hAnsi="Montserrat"/>
@@ -2645,7 +2289,7 @@
                 <w:rFonts w:ascii="Montserrat" w:cs="Montserrat" w:eastAsia="Montserrat" w:hAnsi="Montserrat"/>
                 <w:rtl w:val="0"/>
               </w:rPr>
-              <w:t xml:space="preserve">ÖVRIGT</w:t>
+              <w:t xml:space="preserve">OTHER</w:t>
             </w:r>
           </w:p>
         </w:tc>
@@ -2902,7 +2546,12 @@
               <w:rPr>
                 <w:rtl w:val="0"/>
               </w:rPr>
-              <w:t xml:space="preserve">Svenska - modersmål.</w:t>
+              <w:t xml:space="preserve">Swedish - Fluent.</w:t>
+            </w:r>
+            <w:r>
+              <w:rPr>
+                <w:rtl w:val="0"/>
+              </w:rPr>
             </w:r>
           </w:p>
           <w:p>
@@ -2912,12 +2561,13 @@
                 <w:numId w:val="1"/>
               </w:numPr>
               <w:ind w:left="720" w:hanging="360"/>
-            </w:pPr>
-            <w:r>
-              <w:rPr>
-                <w:rtl w:val="0"/>
-              </w:rPr>
-              <w:t xml:space="preserve">Engelska - mycket bra kunskaper.</w:t>
+              <w:rPr/>
+            </w:pPr>
+            <w:r>
+              <w:rPr>
+                <w:rtl w:val="0"/>
+              </w:rPr>
+              <w:t xml:space="preserve">English - Advanced.</w:t>
             </w:r>
           </w:p>
           <w:p>
@@ -2927,12 +2577,13 @@
                 <w:numId w:val="1"/>
               </w:numPr>
               <w:ind w:left="720" w:hanging="360"/>
-            </w:pPr>
-            <w:r>
-              <w:rPr>
-                <w:rtl w:val="0"/>
-              </w:rPr>
-              <w:t xml:space="preserve">B-körkort (tillgång till bil).</w:t>
+              <w:rPr/>
+            </w:pPr>
+            <w:r>
+              <w:rPr>
+                <w:rtl w:val="0"/>
+              </w:rPr>
+              <w:t xml:space="preserve">Drivers license (Access to car).</w:t>
             </w:r>
           </w:p>
           <w:p>
@@ -2942,12 +2593,13 @@
                 <w:numId w:val="1"/>
               </w:numPr>
               <w:ind w:left="720" w:hanging="360"/>
-            </w:pPr>
-            <w:r>
-              <w:rPr>
-                <w:rtl w:val="0"/>
-              </w:rPr>
-              <w:t xml:space="preserve">Erfarenhet inom nätverk, elektronik, servrar, diverse operativsystem (Linux, Windows, Mac osv), lödning m.m.</w:t>
+              <w:rPr/>
+            </w:pPr>
+            <w:r>
+              <w:rPr>
+                <w:rtl w:val="0"/>
+              </w:rPr>
+              <w:t xml:space="preserve">Experienced in network, electronics, servers, many operating systems (Linux, Windows, Mac), soldering and more.</w:t>
             </w:r>
           </w:p>
         </w:tc>
@@ -3046,6 +2698,8 @@
               <w:tabs>
                 <w:tab w:val="left" w:leader="none" w:pos="2520"/>
                 <w:tab w:val="left" w:leader="none" w:pos="3360"/>
+                <w:tab w:val="left" w:leader="none" w:pos="2520"/>
+                <w:tab w:val="left" w:leader="none" w:pos="3360"/>
               </w:tabs>
               <w:rPr>
                 <w:rFonts w:ascii="Montserrat" w:cs="Montserrat" w:eastAsia="Montserrat" w:hAnsi="Montserrat"/>
@@ -3056,7 +2710,7 @@
                 <w:rFonts w:ascii="Montserrat" w:cs="Montserrat" w:eastAsia="Montserrat" w:hAnsi="Montserrat"/>
                 <w:rtl w:val="0"/>
               </w:rPr>
-              <w:t xml:space="preserve">REFERNSER</w:t>
+              <w:t xml:space="preserve">REFERENCE</w:t>
             </w:r>
           </w:p>
         </w:tc>
@@ -3305,7 +2959,7 @@
               <w:rPr>
                 <w:rtl w:val="0"/>
               </w:rPr>
-              <w:t xml:space="preserve">Lämnas på begäran.</w:t>
+              <w:t xml:space="preserve">Sent on request.</w:t>
             </w:r>
           </w:p>
         </w:tc>
@@ -3313,7 +2967,7 @@
       <w:tr>
         <w:trPr>
           <w:cantSplit w:val="0"/>
-          <w:trHeight w:val="1099.6862792968748" w:hRule="atLeast"/>
+          <w:trHeight w:val="1920" w:hRule="atLeast"/>
           <w:tblHeader w:val="0"/>
         </w:trPr>
         <w:tc>
@@ -3527,6 +3181,121 @@
     <w:name w:val="normal"/>
   </w:style>
   <w:style w:type="table" w:styleId="TableNormal" w:default="1">
+    <w:name w:val="TableNormal"/>
+  </w:style>
+  <w:style w:type="paragraph" w:styleId="Heading1">
+    <w:name w:val="heading 1"/>
+    <w:basedOn w:val="Normal"/>
+    <w:next w:val="Normal"/>
+    <w:pPr>
+      <w:tabs>
+        <w:tab w:val="left" w:leader="none" w:pos="2520"/>
+        <w:tab w:val="left" w:leader="none" w:pos="3360"/>
+      </w:tabs>
+      <w:spacing w:after="120" w:before="120" w:lineRule="auto"/>
+    </w:pPr>
+    <w:rPr>
+      <w:rFonts w:ascii="Posterama" w:cs="Posterama" w:eastAsia="Posterama" w:hAnsi="Posterama"/>
+      <w:b w:val="1"/>
+      <w:smallCaps w:val="1"/>
+      <w:color w:val="6d509b"/>
+      <w:sz w:val="28"/>
+      <w:szCs w:val="28"/>
+    </w:rPr>
+  </w:style>
+  <w:style w:type="paragraph" w:styleId="Heading2">
+    <w:name w:val="heading 2"/>
+    <w:basedOn w:val="Normal"/>
+    <w:next w:val="Normal"/>
+    <w:pPr>
+      <w:keepNext w:val="1"/>
+      <w:tabs>
+        <w:tab w:val="left" w:leader="none" w:pos="720"/>
+        <w:tab w:val="left" w:leader="none" w:pos="1199"/>
+      </w:tabs>
+    </w:pPr>
+    <w:rPr>
+      <w:rFonts w:ascii="Posterama" w:cs="Posterama" w:eastAsia="Posterama" w:hAnsi="Posterama"/>
+      <w:b w:val="1"/>
+      <w:color w:val="6d509b"/>
+    </w:rPr>
+  </w:style>
+  <w:style w:type="paragraph" w:styleId="Heading3">
+    <w:name w:val="heading 3"/>
+    <w:basedOn w:val="Normal"/>
+    <w:next w:val="Normal"/>
+    <w:pPr>
+      <w:keepNext w:val="1"/>
+      <w:tabs>
+        <w:tab w:val="left" w:leader="none" w:pos="900"/>
+        <w:tab w:val="left" w:leader="none" w:pos="1560"/>
+      </w:tabs>
+      <w:spacing w:after="120" w:line="240" w:lineRule="auto"/>
+    </w:pPr>
+    <w:rPr/>
+  </w:style>
+  <w:style w:type="paragraph" w:styleId="Heading4">
+    <w:name w:val="heading 4"/>
+    <w:basedOn w:val="Normal"/>
+    <w:next w:val="Normal"/>
+    <w:pPr>
+      <w:spacing w:line="240" w:lineRule="auto"/>
+    </w:pPr>
+    <w:rPr>
+      <w:rFonts w:ascii="Posterama" w:cs="Posterama" w:eastAsia="Posterama" w:hAnsi="Posterama"/>
+      <w:smallCaps w:val="1"/>
+      <w:sz w:val="18"/>
+      <w:szCs w:val="18"/>
+    </w:rPr>
+  </w:style>
+  <w:style w:type="paragraph" w:styleId="Heading5">
+    <w:name w:val="heading 5"/>
+    <w:basedOn w:val="Normal"/>
+    <w:next w:val="Normal"/>
+    <w:pPr>
+      <w:spacing w:after="240" w:line="240" w:lineRule="auto"/>
+    </w:pPr>
+    <w:rPr>
+      <w:rFonts w:ascii="Posterama" w:cs="Posterama" w:eastAsia="Posterama" w:hAnsi="Posterama"/>
+      <w:color w:val="6d509b"/>
+      <w:sz w:val="24"/>
+      <w:szCs w:val="24"/>
+    </w:rPr>
+  </w:style>
+  <w:style w:type="paragraph" w:styleId="Heading6">
+    <w:name w:val="heading 6"/>
+    <w:basedOn w:val="Normal"/>
+    <w:next w:val="Normal"/>
+    <w:pPr>
+      <w:keepNext w:val="1"/>
+      <w:keepLines w:val="1"/>
+      <w:spacing w:before="40" w:lineRule="auto"/>
+    </w:pPr>
+    <w:rPr>
+      <w:rFonts w:ascii="Posterama" w:cs="Posterama" w:eastAsia="Posterama" w:hAnsi="Posterama"/>
+      <w:color w:val="36274d"/>
+    </w:rPr>
+  </w:style>
+  <w:style w:type="paragraph" w:styleId="Title">
+    <w:name w:val="Title"/>
+    <w:basedOn w:val="Normal"/>
+    <w:next w:val="Normal"/>
+    <w:pPr>
+      <w:widowControl w:val="0"/>
+      <w:spacing w:line="240" w:lineRule="auto"/>
+    </w:pPr>
+    <w:rPr>
+      <w:rFonts w:ascii="Posterama" w:cs="Posterama" w:eastAsia="Posterama" w:hAnsi="Posterama"/>
+      <w:b w:val="1"/>
+      <w:color w:val="6d509b"/>
+      <w:sz w:val="48"/>
+      <w:szCs w:val="48"/>
+    </w:rPr>
+  </w:style>
+  <w:style w:type="paragraph" w:styleId="Normal" w:default="1">
+    <w:name w:val="normal"/>
+  </w:style>
+  <w:style w:type="table" w:styleId="TableNormal" w:default="1">
     <w:name w:val="Table Normal"/>
   </w:style>
   <w:style w:type="paragraph" w:styleId="Heading1">
@@ -4665,6 +4434,37 @@
       <w:color w:val="000000" w:themeColor="text1"/>
       <w:sz w:val="10"/>
     </w:rPr>
+  </w:style>
+  <w:style w:type="paragraph" w:styleId="Subtitle">
+    <w:name w:val="Subtitle"/>
+    <w:basedOn w:val="Normal"/>
+    <w:next w:val="Normal"/>
+    <w:pPr>
+      <w:keepNext w:val="1"/>
+      <w:keepLines w:val="1"/>
+      <w:pageBreakBefore w:val="0"/>
+      <w:spacing w:after="80" w:before="360" w:lineRule="auto"/>
+    </w:pPr>
+    <w:rPr>
+      <w:rFonts w:ascii="Georgia" w:cs="Georgia" w:eastAsia="Georgia" w:hAnsi="Georgia"/>
+      <w:i w:val="1"/>
+      <w:color w:val="666666"/>
+      <w:sz w:val="48"/>
+      <w:szCs w:val="48"/>
+    </w:rPr>
+  </w:style>
+  <w:style w:type="table" w:styleId="Table1">
+    <w:basedOn w:val="TableNormal"/>
+    <w:tblPr>
+      <w:tblStyleRowBandSize w:val="1"/>
+      <w:tblStyleColBandSize w:val="1"/>
+      <w:tblCellMar>
+        <w:top w:w="0.0" w:type="dxa"/>
+        <w:left w:w="115.0" w:type="dxa"/>
+        <w:bottom w:w="0.0" w:type="dxa"/>
+        <w:right w:w="115.0" w:type="dxa"/>
+      </w:tblCellMar>
+    </w:tblPr>
   </w:style>
   <w:style w:type="paragraph" w:styleId="Subtitle">
     <w:name w:val="Subtitle"/>
@@ -4903,7 +4703,7 @@
 
 <file path=customXML/item1.xml><?xml version="1.0" encoding="utf-8"?>
 <go:gDocsCustomXmlDataStorage xmlns:go="http://customooxmlschemas.google.com/" xmlns:r="http://schemas.openxmlformats.org/officeDocument/2006/relationships" uri="GoogleDocsCustomDataVersion2">
-  <go:docsCustomData xmlns:go="http://customooxmlschemas.google.com/" roundtripDataSignature="AMtx7mglnU76H9pUSoR5Ow0sJB7byT6VVA==">CgMxLjAyDmguemdpbW8zNGhrNjhiMg5oLmVram1hODd1a2diMDIOaC5mY3M1dWE1YzJ4NWUyDmguNzByd21hZ3JvNXNuMg5oLmJud3piejEwd3JtNTIOaC5qOGs5MjN2YnF2bGYyDmgua2E3NHJnaXVydXpnOAByITFyamtJdFVaaFpXMU12NXdQX3g2UzM1MXRXWGhURWR5Tg==</go:docsCustomData>
+  <go:docsCustomData xmlns:go="http://customooxmlschemas.google.com/" roundtripDataSignature="AMtx7mjPYN5iZv/y7RzV7A+8fOL6AIamiQ==">CgMxLjAyDmguODh2dWcwaXg4Y2xwMg5oLjcwcndtYWdybzVzbjIOaC4xaGljODhsYjY5djkyDmguNjNianltYmF6aDB3Mg5oLmo4azkyM3ZicXZsZjIOaC5rYTc0cmdpdXJ1emc4AHIhMUNMY2hZeURkMU41Y2QxRjVfbFAxRnpFU256S1Mzc2xT</go:docsCustomData>
 </go:gDocsCustomXmlDataStorage>
 </file>
 

</xml_diff>